<commit_message>
Presentation: trajectory slide walks through OsmAnd seed 314
Slide 10 now shows the hardest task step by step (OsmAnd, seed 314, PASS
in 23 steps): steps 5, 9, 11, 16, 22 and 23 with one verbatim sentence of
the model's reasoning each (checked against the log by the patch script).
The use-case caption and the run-log notes no longer point to the Markor
walkthrough. Briefing and run log updated.

Co-Authored-By: Claude Opus 5.5 <noreply@anthropic.com>
</commit_message>
<xml_diff>
--- a/presentation/Run_Log_Final_Evaluation.docx
+++ b/presentation/Run_Log_Final_Evaluation.docx
@@ -4202,7 +4202,7 @@
           <w:p>
             <w:r/>
             <w:r>
-              <w:t>The run shown step by step on the trajectory slide: new file, name and extension, text, Save, SMS app, number, same text, SMS button.</w:t>
+              <w:t>New file, name and extension, text, Save; then Simple SMS Messenger, number, the text, SMS button. 15 steps.</w:t>
             </w:r>
           </w:p>
         </w:tc>
@@ -4911,7 +4911,7 @@
           <w:p>
             <w:r/>
             <w:r>
-              <w:t>Same procedure as run 1; the accessibility service's “keeps stopping” dialog appeared and the model closed it; one unfocused Type was refused.</w:t>
+              <w:t>Same procedure as run 1; the accessibility service's “keeps stopping” dialog appeared and the model closed it; one unfocused Type was refused. Shown on slide 10.</w:t>
             </w:r>
           </w:p>
         </w:tc>

</xml_diff>